<commit_message>
Correct runnable lab count (11 to 10) in Apress proposal
labs/PauliMatrix.fsx is a shared helper module, not a standalone lab;
the book markets 10 lab exercises (labs/01..10). Regenerated DOCX.

Co-authored-by: Copilot App <223556219+Copilot@users.noreply.github.com>
</commit_message>
<xml_diff>
--- a/proposal/apress/apress-book-proposal.docx
+++ b/proposal/apress/apress-book-proposal.docx
@@ -504,7 +504,7 @@
         <w:pStyle w:val="BodyText"/>
       </w:pPr>
       <w:r>
-        <w:t xml:space="preserve">Every transformation is executable. The companion is FockMap, an open-source F# library published on NuGet, built around a deliberately raw, physicist-facing Hamiltonian API, canonical H₂ fixtures with published release provenance, and an extensive automated test suite. Eleven interactive lab scripts and ten data-generation/verification scripts let readers reproduce every number in the book, one command at a time, from a one-click Codespaces environment. A second running example — a fixed-bond water angular scan — is used honestly to mark exactly where the translation layer ends and where separate algorithmic tasks (state preparation, VQE/QPE energy estimation) begin.</w:t>
+        <w:t xml:space="preserve">Every transformation is executable. The companion is FockMap, an open-source F# library published on NuGet, built around a deliberately raw, physicist-facing Hamiltonian API, canonical H₂ fixtures with published release provenance, and an extensive automated test suite. Ten interactive lab scripts and ten data-generation/verification scripts let readers reproduce every number in the book, one command at a time, from a one-click Codespaces environment. A second running example — a fixed-bond water angular scan — is used honestly to mark exactly where the translation layer ends and where separate algorithmic tasks (state preparation, VQE/QPE energy estimation) begin.</w:t>
       </w:r>
     </w:p>
     <w:p>
@@ -818,7 +818,7 @@
           <w:b/>
           <w:bCs/>
         </w:rPr>
-        <w:t xml:space="preserve">11 interactive lab scripts</w:t>
+        <w:t xml:space="preserve">10 interactive lab scripts</w:t>
       </w:r>
       <w:r>
         <w:t xml:space="preserve"> </w:t>
@@ -830,7 +830,7 @@
         <w:rPr>
           <w:rStyle w:val="VerbatimChar"/>
         </w:rPr>
-        <w:t xml:space="preserve">labs/*.fsx</w:t>
+        <w:t xml:space="preserve">labs/01..10-*.fsx</w:t>
       </w:r>
       <w:r>
         <w:t xml:space="preserve">), each runnable with</w:t>
@@ -845,7 +845,25 @@
         <w:t xml:space="preserve">dotnet fsi</w:t>
       </w:r>
       <w:r>
-        <w:t xml:space="preserve">.</w:t>
+        <w:t xml:space="preserve"> </w:t>
+      </w:r>
+      <w:r>
+        <w:t xml:space="preserve">(plus a shared</w:t>
+      </w:r>
+      <w:r>
+        <w:t xml:space="preserve"> </w:t>
+      </w:r>
+      <w:r>
+        <w:rPr>
+          <w:rStyle w:val="VerbatimChar"/>
+        </w:rPr>
+        <w:t xml:space="preserve">PauliMatrix.fsx</w:t>
+      </w:r>
+      <w:r>
+        <w:t xml:space="preserve"> </w:t>
+      </w:r>
+      <w:r>
+        <w:t xml:space="preserve">helper module).</w:t>
       </w:r>
     </w:p>
     <w:p>
@@ -2255,7 +2273,7 @@
               <w:jc w:val="left"/>
             </w:pPr>
             <w:r>
-              <w:t xml:space="preserve">11 (</w:t>
+              <w:t xml:space="preserve">10 (</w:t>
             </w:r>
             <w:r>
               <w:rPr>

</xml_diff>

<commit_message>
Add required Keywords field to Apress proposal
12 keywords for the Apress metadata form. Regenerated DOCX.

Co-authored-by: Copilot App <223556219+Copilot@users.noreply.github.com>
</commit_message>
<xml_diff>
--- a/proposal/apress/apress-book-proposal.docx
+++ b/proposal/apress/apress-book-proposal.docx
@@ -44,7 +44,7 @@
         </w:p>
       </w:sdtContent>
     </w:sdt>
-    <w:bookmarkStart w:id="24" w:name="apress-book-proposal"/>
+    <w:bookmarkStart w:id="25" w:name="apress-book-proposal"/>
     <w:p>
       <w:pPr>
         <w:pStyle w:val="Heading1"/>
@@ -759,13 +759,31 @@
       </w:r>
     </w:p>
     <w:bookmarkEnd w:id="14"/>
-    <w:bookmarkStart w:id="15" w:name="source-code-and-ancillary-materials"/>
+    <w:bookmarkStart w:id="15" w:name="keywords"/>
     <w:p>
       <w:pPr>
         <w:pStyle w:val="Heading2"/>
       </w:pPr>
       <w:r>
-        <w:t xml:space="preserve">7. Source code and ancillary materials</w:t>
+        <w:t xml:space="preserve">7. Keywords</w:t>
+      </w:r>
+    </w:p>
+    <w:p>
+      <w:pPr>
+        <w:pStyle w:val="FirstParagraph"/>
+      </w:pPr>
+      <w:r>
+        <w:t xml:space="preserve">fermion-to-qubit encoding · quantum chemistry simulation · Jordan–Wigner transform · Bravyi–Kitaev transform · qubit tapering · Trotterization · quantum circuit compilation · molecular Hamiltonian · OpenQASM · VQE (variational quantum eigensolver) · quantum resource estimation · F# / functional programming</w:t>
+      </w:r>
+    </w:p>
+    <w:bookmarkEnd w:id="15"/>
+    <w:bookmarkStart w:id="16" w:name="source-code-and-ancillary-materials"/>
+    <w:p>
+      <w:pPr>
+        <w:pStyle w:val="Heading2"/>
+      </w:pPr>
+      <w:r>
+        <w:t xml:space="preserve">8. Source code and ancillary materials</w:t>
       </w:r>
     </w:p>
     <w:p>
@@ -966,14 +984,14 @@
         <w:t xml:space="preserve">A companion research-evidence repository backs the book’s computed numbers; the manuscript and labs have been correctness- and reproducibility-checked.</w:t>
       </w:r>
     </w:p>
-    <w:bookmarkEnd w:id="15"/>
-    <w:bookmarkStart w:id="16" w:name="table-of-contents-tentative"/>
+    <w:bookmarkEnd w:id="16"/>
+    <w:bookmarkStart w:id="17" w:name="table-of-contents-tentative"/>
     <w:p>
       <w:pPr>
         <w:pStyle w:val="Heading2"/>
       </w:pPr>
       <w:r>
-        <w:t xml:space="preserve">8. Table of contents (tentative)</w:t>
+        <w:t xml:space="preserve">9. Table of contents (tentative)</w:t>
       </w:r>
     </w:p>
     <w:p>
@@ -2038,14 +2056,14 @@
         </w:tc>
       </w:tr>
     </w:tbl>
-    <w:bookmarkEnd w:id="16"/>
-    <w:bookmarkStart w:id="17" w:name="estimated-length"/>
+    <w:bookmarkEnd w:id="17"/>
+    <w:bookmarkStart w:id="18" w:name="estimated-length"/>
     <w:p>
       <w:pPr>
         <w:pStyle w:val="Heading2"/>
       </w:pPr>
       <w:r>
-        <w:t xml:space="preserve">9. Estimated length</w:t>
+        <w:t xml:space="preserve">10. Estimated length</w:t>
       </w:r>
     </w:p>
     <w:tbl>
@@ -2384,14 +2402,14 @@
         <w:t xml:space="preserve">A complete first draft exists today; the delta to an Apress final is editorial (practitioner-facing chapter intros, condensed introductory material, expanded code walkthroughs, index/glossary), not new research.</w:t>
       </w:r>
     </w:p>
-    <w:bookmarkEnd w:id="17"/>
-    <w:bookmarkStart w:id="18" w:name="competition-and-complementary-works"/>
+    <w:bookmarkEnd w:id="18"/>
+    <w:bookmarkStart w:id="19" w:name="competition-and-complementary-works"/>
     <w:p>
       <w:pPr>
         <w:pStyle w:val="Heading2"/>
       </w:pPr>
       <w:r>
-        <w:t xml:space="preserve">10. Competition and complementary works</w:t>
+        <w:t xml:space="preserve">11. Competition and complementary works</w:t>
       </w:r>
     </w:p>
     <w:tbl>
@@ -3001,14 +3019,14 @@
         <w:t xml:space="preserve">as an executable engineering pipeline — molecular integrals → second quantization → six encodings → tapering → Trotterization → OpenQASM/Q# — with every intermediate exposed, independently verified, and reproducible from an open-source library. This is neither another general quantum-computing textbook nor another quantum-chemistry textbook; it is the missing bridge between them.</w:t>
       </w:r>
     </w:p>
-    <w:bookmarkEnd w:id="18"/>
-    <w:bookmarkStart w:id="19" w:name="why-now"/>
+    <w:bookmarkEnd w:id="19"/>
+    <w:bookmarkStart w:id="20" w:name="why-now"/>
     <w:p>
       <w:pPr>
         <w:pStyle w:val="Heading2"/>
       </w:pPr>
       <w:r>
-        <w:t xml:space="preserve">11. Why now</w:t>
+        <w:t xml:space="preserve">12. Why now</w:t>
       </w:r>
     </w:p>
     <w:p>
@@ -3019,14 +3037,14 @@
         <w:t xml:space="preserve">Quantum-simulation toolchains are maturing, but the encoding/compilation layer remains the least-documented and most error-prone part of the stack for practitioners. Engineers arriving from software and chemistry need a reproducible, vendor-neutral account of how a molecule becomes a circuit. This book meets that need with released, testable code rather than pseudocode.</w:t>
       </w:r>
     </w:p>
-    <w:bookmarkEnd w:id="19"/>
-    <w:bookmarkStart w:id="20" w:name="X98ee03a9773b12ad9e25ea6e84e1a8439cd9e69"/>
+    <w:bookmarkEnd w:id="20"/>
+    <w:bookmarkStart w:id="21" w:name="X98ee03a9773b12ad9e25ea6e84e1a8439cd9e69"/>
     <w:p>
       <w:pPr>
         <w:pStyle w:val="Heading2"/>
       </w:pPr>
       <w:r>
-        <w:t xml:space="preserve">12. Delivery schedule (for author confirmation)</w:t>
+        <w:t xml:space="preserve">13. Delivery schedule (for author confirmation)</w:t>
       </w:r>
     </w:p>
     <w:tbl>
@@ -3155,14 +3173,14 @@
         <w:t xml:space="preserve">Dates are derived from current manuscript maturity (a complete first draft exists) and are proposed for confirmation.</w:t>
       </w:r>
     </w:p>
-    <w:bookmarkEnd w:id="20"/>
-    <w:bookmarkStart w:id="21" w:name="proposed-technical-reviewers"/>
+    <w:bookmarkEnd w:id="21"/>
+    <w:bookmarkStart w:id="22" w:name="proposed-technical-reviewers"/>
     <w:p>
       <w:pPr>
         <w:pStyle w:val="Heading2"/>
       </w:pPr>
       <w:r>
-        <w:t xml:space="preserve">13. Proposed technical reviewers</w:t>
+        <w:t xml:space="preserve">14. Proposed technical reviewers</w:t>
       </w:r>
     </w:p>
     <w:p>
@@ -3377,14 +3395,14 @@
         </w:tc>
       </w:tr>
     </w:tbl>
-    <w:bookmarkEnd w:id="21"/>
-    <w:bookmarkStart w:id="22" w:name="apress-open-open-access"/>
+    <w:bookmarkEnd w:id="22"/>
+    <w:bookmarkStart w:id="23" w:name="apress-open-open-access"/>
     <w:p>
       <w:pPr>
         <w:pStyle w:val="Heading2"/>
       </w:pPr>
       <w:r>
-        <w:t xml:space="preserve">14. Apress Open (open access)</w:t>
+        <w:t xml:space="preserve">15. Apress Open (open access)</w:t>
       </w:r>
     </w:p>
     <w:p>
@@ -3395,14 +3413,14 @@
         <w:t xml:space="preserve">Not at this stage; open to discussing it if institutional or sponsor funding is available.</w:t>
       </w:r>
     </w:p>
-    <w:bookmarkEnd w:id="22"/>
-    <w:bookmarkStart w:id="23" w:name="X92b19fc9fad47211960c52d2d3989b718a41785"/>
+    <w:bookmarkEnd w:id="23"/>
+    <w:bookmarkStart w:id="24" w:name="X92b19fc9fad47211960c52d2d3989b718a41785"/>
     <w:p>
       <w:pPr>
         <w:pStyle w:val="Heading2"/>
       </w:pPr>
       <w:r>
-        <w:t xml:space="preserve">15. Relationship to the author’s other proposed Apress book</w:t>
+        <w:t xml:space="preserve">16. Relationship to the author’s other proposed Apress book</w:t>
       </w:r>
     </w:p>
     <w:p>
@@ -3445,8 +3463,8 @@
         <w:t xml:space="preserve">is application-first and breadth-oriented, surveying multiple industry problems. They share an author and a hands-on, no-hype philosophy but serve different readers and reading goals. The author requests that the two proposals be evaluated and approved independently; neither is a prerequisite for, or dependent on, the other.</w:t>
       </w:r>
     </w:p>
-    <w:bookmarkEnd w:id="23"/>
     <w:bookmarkEnd w:id="24"/>
+    <w:bookmarkEnd w:id="25"/>
     <w:sectPr>
       <w:footnotePr>
         <w:numRestart w:val="eachSect"/>

</xml_diff>

<commit_message>
Apply confirmed author decisions to Apress proposal
Final subtitle "A Hands-On Pipeline from Electronic Structure to
Hardware-Ready Circuits"; schedule set to sample chapters 30 Sep 2026
and full revision 31 Mar 2027; Apress Open confirmed. Updated strategy
and checklist; regenerated DOCX.

Co-authored-by: Copilot App <223556219+Copilot@users.noreply.github.com>
</commit_message>
<xml_diff>
--- a/proposal/apress/apress-book-proposal.docx
+++ b/proposal/apress/apress-book-proposal.docx
@@ -84,7 +84,7 @@
         <w:t xml:space="preserve"> </w:t>
       </w:r>
       <w:r>
-        <w:t xml:space="preserve">An Engineer’s Guide to Fermion-to-Qubit Encodings with Open-Source Tools</w:t>
+        <w:t xml:space="preserve">A Hands-On Pipeline from Electronic Structure to Hardware-Ready Circuits</w:t>
       </w:r>
       <w:r>
         <w:t xml:space="preserve"> </w:t>
@@ -3038,13 +3038,13 @@
       </w:r>
     </w:p>
     <w:bookmarkEnd w:id="20"/>
-    <w:bookmarkStart w:id="21" w:name="X98ee03a9773b12ad9e25ea6e84e1a8439cd9e69"/>
+    <w:bookmarkStart w:id="21" w:name="delivery-schedule"/>
     <w:p>
       <w:pPr>
         <w:pStyle w:val="Heading2"/>
       </w:pPr>
       <w:r>
-        <w:t xml:space="preserve">13. Delivery schedule (for author confirmation)</w:t>
+        <w:t xml:space="preserve">13. Delivery schedule</w:t>
       </w:r>
     </w:p>
     <w:tbl>
@@ -3133,7 +3133,7 @@
               <w:jc w:val="left"/>
             </w:pPr>
             <w:r>
-              <w:t xml:space="preserve">31 October 2026</w:t>
+              <w:t xml:space="preserve">30 September 2026</w:t>
             </w:r>
           </w:p>
         </w:tc>
@@ -3159,7 +3159,7 @@
               <w:jc w:val="left"/>
             </w:pPr>
             <w:r>
-              <w:t xml:space="preserve">30 April 2027</w:t>
+              <w:t xml:space="preserve">31 March 2027</w:t>
             </w:r>
           </w:p>
         </w:tc>
@@ -3170,7 +3170,7 @@
         <w:pStyle w:val="BodyText"/>
       </w:pPr>
       <w:r>
-        <w:t xml:space="preserve">Dates are derived from current manuscript maturity (a complete first draft exists) and are proposed for confirmation.</w:t>
+        <w:t xml:space="preserve">Dates are derived from current manuscript maturity (a complete first draft exists) and are confirmed by the author.</w:t>
       </w:r>
     </w:p>
     <w:bookmarkEnd w:id="21"/>
@@ -3410,7 +3410,7 @@
         <w:pStyle w:val="FirstParagraph"/>
       </w:pPr>
       <w:r>
-        <w:t xml:space="preserve">Not at this stage; open to discussing it if institutional or sponsor funding is available.</w:t>
+        <w:t xml:space="preserve">Not at this stage; open to discussing it if institutional or sponsor funding is available. (Confirmed.)</w:t>
       </w:r>
     </w:p>
     <w:bookmarkEnd w:id="23"/>

</xml_diff>

<commit_message>
Apply acquisitions-review corrections to Apress proposal
Subtitle -> "...to Exportable Quantum Circuits"; replace hardware-ready
wording and clarify exported circuits still need transpilation, mapping,
calibration, and state-prep/algorithm layers. Hedge absolutes (drop
"The only" and "No competing"). Combined submission email covering both
invited books with a shared 31 Mar 2027 outside date and flexible
milestone sequencing. Fix stale lab count and Oct/Apr schedule in
strategy; Foreword -> Preface in proposal-facing TOC; drop resolved
checklist item. Regenerated DOCX.

Co-authored-by: Copilot App <223556219+Copilot@users.noreply.github.com>
</commit_message>
<xml_diff>
--- a/proposal/apress/apress-book-proposal.docx
+++ b/proposal/apress/apress-book-proposal.docx
@@ -84,7 +84,7 @@
         <w:t xml:space="preserve"> </w:t>
       </w:r>
       <w:r>
-        <w:t xml:space="preserve">A Hands-On Pipeline from Electronic Structure to Hardware-Ready Circuits</w:t>
+        <w:t xml:space="preserve">A Hands-On Pipeline from Electronic Structure to Exportable Quantum Circuits</w:t>
       </w:r>
       <w:r>
         <w:t xml:space="preserve"> </w:t>
@@ -488,7 +488,7 @@
         <w:pStyle w:val="FirstParagraph"/>
       </w:pPr>
       <w:r>
-        <w:t xml:space="preserve">Molecules to Quantum Circuits is a hands-on engineering guide to the one layer of quantum chemistry simulation that almost every other resource treats as a black box: the translation from a molecule’s electronic structure to a hardware-ready quantum circuit. Between the molecule and the circuit sits the fermion-to-qubit encoding — the step that turns creation and annihilation operators into the Pauli strings a quantum computer actually runs. This book opens that box and keeps it open, exposing every coefficient, sign, and intermediate Pauli string along the way.</w:t>
+        <w:t xml:space="preserve">Molecules to Quantum Circuits is a hands-on engineering guide to the one layer of quantum chemistry simulation that almost every other resource treats as a black box: the translation from a molecule’s electronic structure to an exportable quantum circuit. Between the molecule and the circuit sits the fermion-to-qubit encoding — the step that turns creation and annihilation operators into the Pauli strings a quantum computer actually runs. This book opens that box and keeps it open, exposing every coefficient, sign, and intermediate Pauli string along the way.</w:t>
       </w:r>
     </w:p>
     <w:p>
@@ -512,7 +512,7 @@
         <w:pStyle w:val="BodyText"/>
       </w:pPr>
       <w:r>
-        <w:t xml:space="preserve">The result is a practitioner’s guide, not another survey. Readers who work through it can take real molecular integrals and produce a verified, tapered, hardware-portable circuit — and explain every step in between. The book assumes only linear algebra and introductory quantum mechanics; second quantization, Pauli algebra, the encodings, and F# are all developed from scratch. It is written for quantum software engineers, computational chemists, and graduate students who need the encoding and compilation layer explained carefully, concretely, and reproducibly — with the mathematics kept independent of any single vendor SDK.</w:t>
+        <w:t xml:space="preserve">The result is a practitioner’s guide, not another survey. Readers who work through it can take real molecular integrals and produce a verified, tapered circuit exported to OpenQASM 3.0 and Q# — and explain every step in between. That exported circuit is a portable description, not a run-ready program: it still requires backend-specific transpilation, qubit mapping, and calibration, plus the separate state-preparation and algorithm (VQE/QPE) layers, before it yields energies on hardware. The book assumes only linear algebra and introductory quantum mechanics; second quantization, Pauli algebra, the encodings, and F# are all developed from scratch. It is written for quantum software engineers, computational chemists, and graduate students who need the encoding and compilation layer explained carefully, concretely, and reproducibly — with the mathematics kept independent of any single vendor SDK.</w:t>
       </w:r>
     </w:p>
     <w:bookmarkEnd w:id="11"/>
@@ -537,7 +537,7 @@
           <w:b/>
           <w:bCs/>
         </w:rPr>
-        <w:t xml:space="preserve">The only fully executable, black-box-free pipeline from molecular integrals to hardware-ready circuits.</w:t>
+        <w:t xml:space="preserve">A book-length, fully executable, black-box-free pipeline from molecular integrals to exportable quantum circuits.</w:t>
       </w:r>
       <w:r>
         <w:t xml:space="preserve"> </w:t>
@@ -627,7 +627,7 @@
         <w:t xml:space="preserve"> </w:t>
       </w:r>
       <w:r>
-        <w:t xml:space="preserve">- export a hardware-ready circuit to OpenQASM 3.0 and Q#, and validate it against an independent classical reference; and</w:t>
+        <w:t xml:space="preserve">- export a circuit to OpenQASM 3.0 and Q# — a portable description that still needs backend-specific transpilation, qubit mapping, and calibration — and validate it against an independent classical reference; and</w:t>
       </w:r>
       <w:r>
         <w:t xml:space="preserve"> </w:t>
@@ -1088,7 +1088,7 @@
               <w:jc w:val="left"/>
             </w:pPr>
             <w:r>
-              <w:t xml:space="preserve">Foreword &amp; Reader’s Guide</w:t>
+              <w:t xml:space="preserve">Preface &amp; Reader’s Guide</w:t>
             </w:r>
           </w:p>
         </w:tc>
@@ -3000,7 +3000,7 @@
         <w:t xml:space="preserve"> </w:t>
       </w:r>
       <w:r>
-        <w:t xml:space="preserve">No competing book or online resource teaches the</w:t>
+        <w:t xml:space="preserve">We are not aware of another book-length treatment that teaches the</w:t>
       </w:r>
       <w:r>
         <w:t xml:space="preserve"> </w:t>

</xml_diff>